<commit_message>
Publish saved models and executable source-grouped workflow demonstration
</commit_message>
<xml_diff>
--- a/submission_documents_20260916/CG_MainText.docx
+++ b/submission_documents_20260916/CG_MainText.docx
@@ -822,7 +822,7 @@
           <w:color w:val="000000"/>
           <w:sz w:val="24"/>
         </w:rPr>
-        <w:t>Source overlap can compromise evaluation of seismic phase pickers and stacked models. We evaluate a source-grouped temporal stacking workflow combining STA/LTA, AIC, CNN, and TCN outputs with waveform context. A curated STEAD subset contains 2,234 records from 2,114 sources; 335 test records represent 317 sources excluded from fitting and validation. Source-grouped out-of-fold predictions supply meta-training features. On one fixed split, three base seeds crossed with three meta seeds yielded Full3C mean F1 at ±100 ms of 0.8694 for P and 0.5780 for S, versus 0.8723 and 0.3384 for Z-only. The S difference was 0.2396, with a conditional paired source-cluster 95% interval of 0.1874–0.2905; the P interval included zero. A PhaseNet-style MATLAB baseline trained from scratch on the same records achieved Full3C P/S F1 of 0.9661/0.6267 and Z-only F1 of 0.9637/0.3689 across three seeds. The Full3C baseline advantage was supported by conditional intervals for both phases; the Z-only S interval included zero. Original ablations did not establish a dilation benefit. The principal contribution is an inspectable evaluation workflow and evidence of a component-access difference, rather than superior stacking performance. Seed repetitions condition on one curated source split; station, regional, and dataset generalization remain untested.</w:t>
+        <w:t>Source overlap can compromise evaluation of seismic phase pickers and stacked models. We evaluate a source-grouped temporal stacking workflow combining STA/LTA, AIC, CNN, and TCN outputs with waveform context. A curated STEAD subset contains 2,234 records from 2,114 sources; 335 test records represent 317 sources excluded from fitting and validation. Source-grouped out-of-fold predictions supply meta-training features. On one fixed split, three base seeds crossed with three meta seeds yielded Full3C mean F1 at ±100 ms of 0.8694 for P and 0.5780 for S, versus 0.8723 and 0.3384 for Z-only. The S difference was 0.2396, with a conditional paired source-cluster 95% interval of 0.1874–0.2905; the P interval included zero. A PhaseNet-style MATLAB baseline trained from scratch on the same records achieved Full3C P/S F1 of 0.9661/0.6267 and Z-only F1 of 0.9637/0.3689 across three seeds. The Full3C baseline advantage was supported by conditional intervals for both phases; the Z-only S interval included zero. Original ablations did not establish a dilation benefit. The computational contribution is an executable evaluation workflow linking source-identity checks, feature contracts, and saved-model replay, alongside a component-access finding rather than superior stacking performance. Seed repetitions condition on one curated source split; station, regional, and dataset generalization remain untested.</w:t>
       </w:r>
     </w:p>
     <w:p>
@@ -1066,7 +1066,7 @@
           <w:color w:val="000000"/>
           <w:sz w:val="24"/>
         </w:rPr>
-        <w:t>The geoscientific question is how access to horizontal information affects P- and S-arrival timing for unseen earthquake sources within the curated population. Full3C and Z-only use identical records, source assignments, labels, and evaluation rules, but each mode fits its own bases and meta-learners. Figure 1 summarizes the workflow. Standalone and ablation comparisons identify which observed differences support component access and which remain unresolved at the fusion-architecture level.</w:t>
+        <w:t>The geoscientific question is how access to horizontal information affects P- and S-arrival timing for unseen earthquake sources within the curated population. Full3C and Z-only use identical records, source assignments, labels, and evaluation rules, but each mode fits its own bases and meta-learners. Figure 1 summarizes the workflow. Standalone and ablation comparisons identify which observed differences support component access and which remain unresolved at the fusion-architecture level. The reusable software contribution connects source identity across augmentation and OOF construction to a canonical feature interface, model provenance, and numerical replay. These components make otherwise silent lineage or artifact errors observable. Grouped cross-validation, stacking and hashing are established techniques; novelty is not asserted for them individually. The demonstrated contribution is their inspectable integration in a hierarchical seismic workflow, with executable examples and saved models that another group can evaluate.</w:t>
       </w:r>
     </w:p>
     <w:p>
@@ -1110,7 +1110,7 @@
                     </pic:cNvPicPr>
                   </pic:nvPicPr>
                   <pic:blipFill>
-                    <a:blip r:embed="rId7"/>
+                    <a:blip r:embed="rId24"/>
                     <a:stretch>
                       <a:fillRect/>
                     </a:stretch>
@@ -3228,7 +3228,7 @@
                     </pic:cNvPicPr>
                   </pic:nvPicPr>
                   <pic:blipFill>
-                    <a:blip r:embed="rId8" cstate="print">
+                    <a:blip r:embed="rId25" cstate="print">
                       <a:extLst>
                         <a:ext uri="{28A0092B-C50C-407E-A947-70E740481C1C}">
                           <a14:useLocalDpi xmlns:a14="http://schemas.microsoft.com/office/drawing/2010/main" val="0"/>
@@ -6751,7 +6751,7 @@
                     </pic:cNvPicPr>
                   </pic:nvPicPr>
                   <pic:blipFill>
-                    <a:blip r:embed="rId10"/>
+                    <a:blip r:embed="rId29"/>
                     <a:stretch>
                       <a:fillRect/>
                     </a:stretch>
@@ -7309,7 +7309,7 @@
           <w:rFonts w:ascii="Times New Roman" w:hAnsi="Times New Roman"/>
           <w:sz w:val="24"/>
         </w:rPr>
-        <w:t>DP = G. Report tS = t̂S only when S is accepted; otherwise return NaN. An empty DS returns no S pick. The 0.1–30 s rule enforces bounded S-after-P ordering within the record; it is not a learned physical objective. Detected-only scoring is applied after this decoder, so its S gate still uses primary accepted P. Thresholds are fixed in the archived configuration; no new threshold search was performed for these diagnostics.</w:t>
+        <w:t>DP = G. Report tS = t̂S only when S is accepted; otherwise return NaN. An empty DS returns no S pick. The 0.1–30 s rule enforces bounded S-after-P ordering within the record; it is not a learned physical objective. Detected-only scoring is applied after this decoder, so its S gate still uses primary accepted P. The peak threshold 0.30, quality thresholds 3 and S-window bounds 0.1–30 s are documented in the July 2026 configuration and retained in the inspected September configurations (Supplementary Table S20). The current uncertain boundary is half the peak threshold, 0.15. This documents configuration history, not a validation-only calibration: the earliest data used to choose these values remain unestablished. No threshold optimization was performed for this revision.</w:t>
       </w:r>
     </w:p>
     <w:p>
@@ -7340,8 +7340,9 @@
       <w:pPr>
         <w:keepNext/>
         <w:keepLines/>
+        <w:pageBreakBefore/>
         <w:widowControl/>
-        <w:spacing w:before="0" w:after="0" w:line="480" w:lineRule="auto"/>
+        <w:spacing w:before="0" w:after="160" w:line="264" w:lineRule="auto"/>
         <w:ind w:left="0" w:right="0" w:firstLine="0"/>
         <w:jc w:val="both"/>
         <w:rPr>
@@ -7353,10 +7354,10 @@
         <w:rPr>
           <w:rFonts w:ascii="Times New Roman" w:hAnsi="Times New Roman"/>
           <w:color w:val="000000"/>
-          <w:sz w:val="24"/>
+          <w:sz w:val="20"/>
           <w:szCs w:val="20"/>
         </w:rPr>
-        <w:t>Table 3. Hyperparameters and configuration settings used for training the CNN, TCN, and I-CNN MetaPicker framework.</w:t>
+        <w:t>Table 3. Hyperparameters and configuration settings used for training the CNN, TCN, and I-CNN MetaPicker framework. Base seeds 43–44 belong to the extension; original ablations retain base seed 42. PhaseNetMatched architecture and optimization settings are stated separately in Methods.</w:t>
       </w:r>
     </w:p>
     <w:tbl>
@@ -7422,7 +7423,7 @@
           <w:p>
             <w:pPr>
               <w:keepNext/>
-              <w:spacing w:before="0" w:after="40" w:line="480" w:lineRule="auto"/>
+              <w:spacing w:before="60" w:after="60" w:line="252" w:lineRule="auto"/>
               <w:jc w:val="left"/>
             </w:pPr>
             <w:r>
@@ -7430,7 +7431,7 @@
                 <w:rFonts w:ascii="Times New Roman" w:hAnsi="Times New Roman"/>
                 <w:b/>
                 <w:color w:val="000000"/>
-                <w:sz w:val="20"/>
+                <w:sz w:val="18"/>
               </w:rPr>
               <w:t>Category</w:t>
             </w:r>
@@ -7451,7 +7452,7 @@
           <w:p>
             <w:pPr>
               <w:keepNext/>
-              <w:spacing w:before="0" w:after="40" w:line="480" w:lineRule="auto"/>
+              <w:spacing w:before="60" w:after="60" w:line="252" w:lineRule="auto"/>
               <w:jc w:val="center"/>
             </w:pPr>
             <w:r>
@@ -7459,7 +7460,7 @@
                 <w:rFonts w:ascii="Times New Roman" w:hAnsi="Times New Roman"/>
                 <w:b/>
                 <w:color w:val="000000"/>
-                <w:sz w:val="20"/>
+                <w:sz w:val="18"/>
               </w:rPr>
               <w:t>Parameter</w:t>
             </w:r>
@@ -7480,7 +7481,7 @@
           <w:p>
             <w:pPr>
               <w:keepNext/>
-              <w:spacing w:before="0" w:after="40" w:line="480" w:lineRule="auto"/>
+              <w:spacing w:before="60" w:after="60" w:line="252" w:lineRule="auto"/>
               <w:jc w:val="center"/>
             </w:pPr>
             <w:r>
@@ -7488,7 +7489,7 @@
                 <w:rFonts w:ascii="Times New Roman" w:hAnsi="Times New Roman"/>
                 <w:b/>
                 <w:color w:val="000000"/>
-                <w:sz w:val="20"/>
+                <w:sz w:val="18"/>
               </w:rPr>
               <w:t>Final setting</w:t>
             </w:r>
@@ -7530,7 +7531,7 @@
           <w:p>
             <w:pPr>
               <w:keepNext w:val="0"/>
-              <w:spacing w:before="0" w:after="40" w:line="480" w:lineRule="auto"/>
+              <w:spacing w:before="60" w:after="60" w:line="252" w:lineRule="auto"/>
               <w:jc w:val="left"/>
             </w:pPr>
             <w:r>
@@ -7538,7 +7539,7 @@
                 <w:rFonts w:ascii="Times New Roman" w:hAnsi="Times New Roman"/>
                 <w:b w:val="0"/>
                 <w:color w:val="000000"/>
-                <w:sz w:val="20"/>
+                <w:sz w:val="18"/>
               </w:rPr>
               <w:t>Input</w:t>
             </w:r>
@@ -7558,7 +7559,7 @@
           <w:p>
             <w:pPr>
               <w:keepNext w:val="0"/>
-              <w:spacing w:before="0" w:after="40" w:line="480" w:lineRule="auto"/>
+              <w:spacing w:before="60" w:after="60" w:line="252" w:lineRule="auto"/>
               <w:jc w:val="center"/>
             </w:pPr>
             <w:r>
@@ -7566,7 +7567,7 @@
                 <w:rFonts w:ascii="Times New Roman" w:hAnsi="Times New Roman"/>
                 <w:b w:val="0"/>
                 <w:color w:val="000000"/>
-                <w:sz w:val="20"/>
+                <w:sz w:val="18"/>
               </w:rPr>
               <w:t>Waveform / base / meta channels</w:t>
             </w:r>
@@ -7586,7 +7587,7 @@
           <w:p>
             <w:pPr>
               <w:keepNext w:val="0"/>
-              <w:spacing w:before="0" w:after="40" w:line="480" w:lineRule="auto"/>
+              <w:spacing w:before="60" w:after="60" w:line="252" w:lineRule="auto"/>
               <w:jc w:val="center"/>
             </w:pPr>
             <w:r>
@@ -7594,7 +7595,7 @@
                 <w:rFonts w:ascii="Times New Roman" w:hAnsi="Times New Roman"/>
                 <w:b w:val="0"/>
                 <w:color w:val="000000"/>
-                <w:sz w:val="20"/>
+                <w:sz w:val="18"/>
               </w:rPr>
               <w:t>3 / 8 / 15</w:t>
             </w:r>
@@ -7636,7 +7637,7 @@
           <w:p>
             <w:pPr>
               <w:keepNext w:val="0"/>
-              <w:spacing w:before="0" w:after="40" w:line="480" w:lineRule="auto"/>
+              <w:spacing w:before="60" w:after="60" w:line="252" w:lineRule="auto"/>
               <w:jc w:val="left"/>
             </w:pPr>
             <w:r>
@@ -7644,7 +7645,7 @@
                 <w:rFonts w:ascii="Times New Roman" w:hAnsi="Times New Roman"/>
                 <w:b w:val="0"/>
                 <w:color w:val="000000"/>
-                <w:sz w:val="20"/>
+                <w:sz w:val="18"/>
               </w:rPr>
               <w:t>Input</w:t>
             </w:r>
@@ -7664,7 +7665,7 @@
           <w:p>
             <w:pPr>
               <w:keepNext w:val="0"/>
-              <w:spacing w:before="0" w:after="40" w:line="480" w:lineRule="auto"/>
+              <w:spacing w:before="60" w:after="60" w:line="252" w:lineRule="auto"/>
               <w:jc w:val="center"/>
             </w:pPr>
             <w:r>
@@ -7672,7 +7673,7 @@
                 <w:rFonts w:ascii="Times New Roman" w:hAnsi="Times New Roman"/>
                 <w:b w:val="0"/>
                 <w:color w:val="000000"/>
-                <w:sz w:val="20"/>
+                <w:sz w:val="18"/>
               </w:rPr>
               <w:t>Sampling; length</w:t>
             </w:r>
@@ -7692,7 +7693,7 @@
           <w:p>
             <w:pPr>
               <w:keepNext w:val="0"/>
-              <w:spacing w:before="0" w:after="40" w:line="480" w:lineRule="auto"/>
+              <w:spacing w:before="60" w:after="60" w:line="252" w:lineRule="auto"/>
               <w:jc w:val="center"/>
             </w:pPr>
             <w:r>
@@ -7700,7 +7701,7 @@
                 <w:rFonts w:ascii="Times New Roman" w:hAnsi="Times New Roman"/>
                 <w:b w:val="0"/>
                 <w:color w:val="000000"/>
-                <w:sz w:val="20"/>
+                <w:sz w:val="18"/>
               </w:rPr>
               <w:t>100 Hz; 6000 samples</w:t>
             </w:r>
@@ -7742,7 +7743,7 @@
           <w:p>
             <w:pPr>
               <w:keepNext w:val="0"/>
-              <w:spacing w:before="0" w:after="40" w:line="480" w:lineRule="auto"/>
+              <w:spacing w:before="60" w:after="60" w:line="252" w:lineRule="auto"/>
               <w:jc w:val="left"/>
             </w:pPr>
             <w:r>
@@ -7750,7 +7751,7 @@
                 <w:rFonts w:ascii="Times New Roman" w:hAnsi="Times New Roman"/>
                 <w:b w:val="0"/>
                 <w:color w:val="000000"/>
-                <w:sz w:val="20"/>
+                <w:sz w:val="18"/>
               </w:rPr>
               <w:t>Partition</w:t>
             </w:r>
@@ -7770,7 +7771,7 @@
           <w:p>
             <w:pPr>
               <w:keepNext w:val="0"/>
-              <w:spacing w:before="0" w:after="40" w:line="480" w:lineRule="auto"/>
+              <w:spacing w:before="60" w:after="60" w:line="252" w:lineRule="auto"/>
               <w:jc w:val="center"/>
             </w:pPr>
             <w:r>
@@ -7778,7 +7779,7 @@
                 <w:rFonts w:ascii="Times New Roman" w:hAnsi="Times New Roman"/>
                 <w:b w:val="0"/>
                 <w:color w:val="000000"/>
-                <w:sz w:val="20"/>
+                <w:sz w:val="18"/>
               </w:rPr>
               <w:t>Outer grouping</w:t>
             </w:r>
@@ -7798,7 +7799,7 @@
           <w:p>
             <w:pPr>
               <w:keepNext w:val="0"/>
-              <w:spacing w:before="0" w:after="40" w:line="480" w:lineRule="auto"/>
+              <w:spacing w:before="60" w:after="60" w:line="252" w:lineRule="auto"/>
               <w:jc w:val="center"/>
             </w:pPr>
             <w:r>
@@ -7806,7 +7807,7 @@
                 <w:rFonts w:ascii="Times New Roman" w:hAnsi="Times New Roman"/>
                 <w:b w:val="0"/>
                 <w:color w:val="000000"/>
-                <w:sz w:val="20"/>
+                <w:sz w:val="18"/>
               </w:rPr>
               <w:t>source_id; 70/15/15%</w:t>
             </w:r>
@@ -7848,7 +7849,7 @@
           <w:p>
             <w:pPr>
               <w:keepNext w:val="0"/>
-              <w:spacing w:before="0" w:after="40" w:line="480" w:lineRule="auto"/>
+              <w:spacing w:before="60" w:after="60" w:line="252" w:lineRule="auto"/>
               <w:jc w:val="left"/>
             </w:pPr>
             <w:r>
@@ -7856,7 +7857,7 @@
                 <w:rFonts w:ascii="Times New Roman" w:hAnsi="Times New Roman"/>
                 <w:b w:val="0"/>
                 <w:color w:val="000000"/>
-                <w:sz w:val="20"/>
+                <w:sz w:val="18"/>
               </w:rPr>
               <w:t>OOF</w:t>
             </w:r>
@@ -7876,7 +7877,7 @@
           <w:p>
             <w:pPr>
               <w:keepNext w:val="0"/>
-              <w:spacing w:before="0" w:after="40" w:line="480" w:lineRule="auto"/>
+              <w:spacing w:before="60" w:after="60" w:line="252" w:lineRule="auto"/>
               <w:jc w:val="center"/>
             </w:pPr>
             <w:r>
@@ -7884,7 +7885,7 @@
                 <w:rFonts w:ascii="Times New Roman" w:hAnsi="Times New Roman"/>
                 <w:b w:val="0"/>
                 <w:color w:val="000000"/>
-                <w:sz w:val="20"/>
+                <w:sz w:val="18"/>
               </w:rPr>
               <w:t>Folds / inner validation</w:t>
             </w:r>
@@ -7904,7 +7905,7 @@
           <w:p>
             <w:pPr>
               <w:keepNext w:val="0"/>
-              <w:spacing w:before="0" w:after="40" w:line="480" w:lineRule="auto"/>
+              <w:spacing w:before="60" w:after="60" w:line="252" w:lineRule="auto"/>
               <w:jc w:val="center"/>
             </w:pPr>
             <w:r>
@@ -7912,7 +7913,7 @@
                 <w:rFonts w:ascii="Times New Roman" w:hAnsi="Times New Roman"/>
                 <w:b w:val="0"/>
                 <w:color w:val="000000"/>
-                <w:sz w:val="20"/>
+                <w:sz w:val="18"/>
               </w:rPr>
               <w:t>5 / 15% of non-held sources</w:t>
             </w:r>
@@ -7954,7 +7955,7 @@
           <w:p>
             <w:pPr>
               <w:keepNext w:val="0"/>
-              <w:spacing w:before="0" w:after="40" w:line="480" w:lineRule="auto"/>
+              <w:spacing w:before="60" w:after="60" w:line="252" w:lineRule="auto"/>
               <w:jc w:val="left"/>
             </w:pPr>
             <w:r>
@@ -7962,7 +7963,7 @@
                 <w:rFonts w:ascii="Times New Roman" w:hAnsi="Times New Roman"/>
                 <w:b w:val="0"/>
                 <w:color w:val="000000"/>
-                <w:sz w:val="20"/>
+                <w:sz w:val="18"/>
               </w:rPr>
               <w:t>Conditioning</w:t>
             </w:r>
@@ -7982,7 +7983,7 @@
           <w:p>
             <w:pPr>
               <w:keepNext w:val="0"/>
-              <w:spacing w:before="0" w:after="40" w:line="480" w:lineRule="auto"/>
+              <w:spacing w:before="60" w:after="60" w:line="252" w:lineRule="auto"/>
               <w:jc w:val="center"/>
             </w:pPr>
             <w:r>
@@ -7990,7 +7991,7 @@
                 <w:rFonts w:ascii="Times New Roman" w:hAnsi="Times New Roman"/>
                 <w:b w:val="0"/>
                 <w:color w:val="000000"/>
-                <w:sz w:val="20"/>
+                <w:sz w:val="18"/>
               </w:rPr>
               <w:t>Band-pass; normalization</w:t>
             </w:r>
@@ -8010,7 +8011,7 @@
           <w:p>
             <w:pPr>
               <w:keepNext w:val="0"/>
-              <w:spacing w:before="0" w:after="40" w:line="480" w:lineRule="auto"/>
+              <w:spacing w:before="60" w:after="60" w:line="252" w:lineRule="auto"/>
               <w:jc w:val="center"/>
             </w:pPr>
             <w:r>
@@ -8018,7 +8019,7 @@
                 <w:rFonts w:ascii="Times New Roman" w:hAnsi="Times New Roman"/>
                 <w:b w:val="0"/>
                 <w:color w:val="000000"/>
-                <w:sz w:val="20"/>
+                <w:sz w:val="18"/>
               </w:rPr>
               <w:t>1–45 Hz; per component</w:t>
             </w:r>
@@ -8060,7 +8061,7 @@
           <w:p>
             <w:pPr>
               <w:keepNext w:val="0"/>
-              <w:spacing w:before="0" w:after="40" w:line="480" w:lineRule="auto"/>
+              <w:spacing w:before="60" w:after="60" w:line="252" w:lineRule="auto"/>
               <w:jc w:val="left"/>
             </w:pPr>
             <w:r>
@@ -8068,7 +8069,7 @@
                 <w:rFonts w:ascii="Times New Roman" w:hAnsi="Times New Roman"/>
                 <w:b w:val="0"/>
                 <w:color w:val="000000"/>
-                <w:sz w:val="20"/>
+                <w:sz w:val="18"/>
               </w:rPr>
               <w:t>Labels</w:t>
             </w:r>
@@ -8088,7 +8089,7 @@
           <w:p>
             <w:pPr>
               <w:keepNext w:val="0"/>
-              <w:spacing w:before="0" w:after="40" w:line="480" w:lineRule="auto"/>
+              <w:spacing w:before="60" w:after="60" w:line="252" w:lineRule="auto"/>
               <w:jc w:val="center"/>
             </w:pPr>
             <w:r>
@@ -8096,7 +8097,7 @@
                 <w:rFonts w:ascii="Times New Roman" w:hAnsi="Times New Roman"/>
                 <w:b w:val="0"/>
                 <w:color w:val="000000"/>
-                <w:sz w:val="20"/>
+                <w:sz w:val="18"/>
               </w:rPr>
               <w:t>Gaussian P / S widths</w:t>
             </w:r>
@@ -8116,7 +8117,7 @@
           <w:p>
             <w:pPr>
               <w:keepNext w:val="0"/>
-              <w:spacing w:before="0" w:after="40" w:line="480" w:lineRule="auto"/>
+              <w:spacing w:before="60" w:after="60" w:line="252" w:lineRule="auto"/>
               <w:jc w:val="center"/>
             </w:pPr>
             <w:r>
@@ -8124,7 +8125,7 @@
                 <w:rFonts w:ascii="Times New Roman" w:hAnsi="Times New Roman"/>
                 <w:b w:val="0"/>
                 <w:color w:val="000000"/>
-                <w:sz w:val="20"/>
+                <w:sz w:val="18"/>
               </w:rPr>
               <w:t>6 / 8 samples; truncation ±4σ</w:t>
             </w:r>
@@ -8166,7 +8167,7 @@
           <w:p>
             <w:pPr>
               <w:keepNext w:val="0"/>
-              <w:spacing w:before="0" w:after="40" w:line="480" w:lineRule="auto"/>
+              <w:spacing w:before="60" w:after="60" w:line="252" w:lineRule="auto"/>
               <w:jc w:val="left"/>
             </w:pPr>
             <w:r>
@@ -8174,7 +8175,7 @@
                 <w:rFonts w:ascii="Times New Roman" w:hAnsi="Times New Roman"/>
                 <w:b w:val="0"/>
                 <w:color w:val="000000"/>
-                <w:sz w:val="20"/>
+                <w:sz w:val="18"/>
               </w:rPr>
               <w:t>Base CNN</w:t>
             </w:r>
@@ -8194,7 +8195,7 @@
           <w:p>
             <w:pPr>
               <w:keepNext w:val="0"/>
-              <w:spacing w:before="0" w:after="40" w:line="480" w:lineRule="auto"/>
+              <w:spacing w:before="60" w:after="60" w:line="252" w:lineRule="auto"/>
               <w:jc w:val="center"/>
             </w:pPr>
             <w:r>
@@ -8202,7 +8203,7 @@
                 <w:rFonts w:ascii="Times New Roman" w:hAnsi="Times New Roman"/>
                 <w:b w:val="0"/>
                 <w:color w:val="000000"/>
-                <w:sz w:val="20"/>
+                <w:sz w:val="18"/>
               </w:rPr>
               <w:t>Filters; kernel; dropout</w:t>
             </w:r>
@@ -8222,7 +8223,7 @@
           <w:p>
             <w:pPr>
               <w:keepNext w:val="0"/>
-              <w:spacing w:before="0" w:after="40" w:line="480" w:lineRule="auto"/>
+              <w:spacing w:before="60" w:after="60" w:line="252" w:lineRule="auto"/>
               <w:jc w:val="center"/>
             </w:pPr>
             <w:r>
@@ -8230,7 +8231,7 @@
                 <w:rFonts w:ascii="Times New Roman" w:hAnsi="Times New Roman"/>
                 <w:b w:val="0"/>
                 <w:color w:val="000000"/>
-                <w:sz w:val="20"/>
+                <w:sz w:val="18"/>
               </w:rPr>
               <w:t>32,64; 7; 0.30</w:t>
             </w:r>
@@ -8272,7 +8273,7 @@
           <w:p>
             <w:pPr>
               <w:keepNext w:val="0"/>
-              <w:spacing w:before="0" w:after="40" w:line="480" w:lineRule="auto"/>
+              <w:spacing w:before="60" w:after="60" w:line="252" w:lineRule="auto"/>
               <w:jc w:val="left"/>
             </w:pPr>
             <w:r>
@@ -8280,7 +8281,7 @@
                 <w:rFonts w:ascii="Times New Roman" w:hAnsi="Times New Roman"/>
                 <w:b w:val="0"/>
                 <w:color w:val="000000"/>
-                <w:sz w:val="20"/>
+                <w:sz w:val="18"/>
               </w:rPr>
               <w:t>Base TCN</w:t>
             </w:r>
@@ -8300,7 +8301,7 @@
           <w:p>
             <w:pPr>
               <w:keepNext w:val="0"/>
-              <w:spacing w:before="0" w:after="40" w:line="480" w:lineRule="auto"/>
+              <w:spacing w:before="60" w:after="60" w:line="252" w:lineRule="auto"/>
               <w:jc w:val="center"/>
             </w:pPr>
             <w:r>
@@ -8308,7 +8309,7 @@
                 <w:rFonts w:ascii="Times New Roman" w:hAnsi="Times New Roman"/>
                 <w:b w:val="0"/>
                 <w:color w:val="000000"/>
-                <w:sz w:val="20"/>
+                <w:sz w:val="18"/>
               </w:rPr>
               <w:t>Filters; kernel; dilation; dropout</w:t>
             </w:r>
@@ -8328,7 +8329,7 @@
           <w:p>
             <w:pPr>
               <w:keepNext w:val="0"/>
-              <w:spacing w:before="0" w:after="40" w:line="480" w:lineRule="auto"/>
+              <w:spacing w:before="60" w:after="60" w:line="252" w:lineRule="auto"/>
               <w:jc w:val="center"/>
             </w:pPr>
             <w:r>
@@ -8336,7 +8337,7 @@
                 <w:rFonts w:ascii="Times New Roman" w:hAnsi="Times New Roman"/>
                 <w:b w:val="0"/>
                 <w:color w:val="000000"/>
-                <w:sz w:val="20"/>
+                <w:sz w:val="18"/>
               </w:rPr>
               <w:t>32×4; 3; 1,2,4,8; 0.20</w:t>
             </w:r>
@@ -8378,7 +8379,7 @@
           <w:p>
             <w:pPr>
               <w:keepNext w:val="0"/>
-              <w:spacing w:before="0" w:after="40" w:line="480" w:lineRule="auto"/>
+              <w:spacing w:before="60" w:after="60" w:line="252" w:lineRule="auto"/>
               <w:jc w:val="left"/>
             </w:pPr>
             <w:r>
@@ -8386,7 +8387,7 @@
                 <w:rFonts w:ascii="Times New Roman" w:hAnsi="Times New Roman"/>
                 <w:b w:val="0"/>
                 <w:color w:val="000000"/>
-                <w:sz w:val="20"/>
+                <w:sz w:val="18"/>
               </w:rPr>
               <w:t>Base training</w:t>
             </w:r>
@@ -8406,7 +8407,7 @@
           <w:p>
             <w:pPr>
               <w:keepNext w:val="0"/>
-              <w:spacing w:before="0" w:after="40" w:line="480" w:lineRule="auto"/>
+              <w:spacing w:before="60" w:after="60" w:line="252" w:lineRule="auto"/>
               <w:jc w:val="center"/>
             </w:pPr>
             <w:r>
@@ -8414,7 +8415,7 @@
                 <w:rFonts w:ascii="Times New Roman" w:hAnsi="Times New Roman"/>
                 <w:b w:val="0"/>
                 <w:color w:val="000000"/>
-                <w:sz w:val="20"/>
+                <w:sz w:val="18"/>
               </w:rPr>
               <w:t>Adam LR; max epochs</w:t>
             </w:r>
@@ -8434,7 +8435,7 @@
           <w:p>
             <w:pPr>
               <w:keepNext w:val="0"/>
-              <w:spacing w:before="0" w:after="40" w:line="480" w:lineRule="auto"/>
+              <w:spacing w:before="60" w:after="60" w:line="252" w:lineRule="auto"/>
               <w:jc w:val="center"/>
             </w:pPr>
             <w:r>
@@ -8442,7 +8443,7 @@
                 <w:rFonts w:ascii="Times New Roman" w:hAnsi="Times New Roman"/>
                 <w:b w:val="0"/>
                 <w:color w:val="000000"/>
-                <w:sz w:val="20"/>
+                <w:sz w:val="18"/>
               </w:rPr>
               <w:t>1×10⁻³; 30</w:t>
             </w:r>
@@ -8484,7 +8485,7 @@
           <w:p>
             <w:pPr>
               <w:keepNext w:val="0"/>
-              <w:spacing w:before="0" w:after="40" w:line="480" w:lineRule="auto"/>
+              <w:spacing w:before="60" w:after="60" w:line="252" w:lineRule="auto"/>
               <w:jc w:val="left"/>
             </w:pPr>
             <w:r>
@@ -8492,7 +8493,7 @@
                 <w:rFonts w:ascii="Times New Roman" w:hAnsi="Times New Roman"/>
                 <w:b w:val="0"/>
                 <w:color w:val="000000"/>
-                <w:sz w:val="20"/>
+                <w:sz w:val="18"/>
               </w:rPr>
               <w:t>Base training</w:t>
             </w:r>
@@ -8512,7 +8513,7 @@
           <w:p>
             <w:pPr>
               <w:keepNext w:val="0"/>
-              <w:spacing w:before="0" w:after="40" w:line="480" w:lineRule="auto"/>
+              <w:spacing w:before="60" w:after="60" w:line="252" w:lineRule="auto"/>
               <w:jc w:val="center"/>
             </w:pPr>
             <w:r>
@@ -8520,7 +8521,7 @@
                 <w:rFonts w:ascii="Times New Roman" w:hAnsi="Times New Roman"/>
                 <w:b w:val="0"/>
                 <w:color w:val="000000"/>
-                <w:sz w:val="20"/>
+                <w:sz w:val="18"/>
               </w:rPr>
               <w:t>Batch; validation patience</w:t>
             </w:r>
@@ -8540,7 +8541,7 @@
           <w:p>
             <w:pPr>
               <w:keepNext w:val="0"/>
-              <w:spacing w:before="0" w:after="40" w:line="480" w:lineRule="auto"/>
+              <w:spacing w:before="60" w:after="60" w:line="252" w:lineRule="auto"/>
               <w:jc w:val="center"/>
             </w:pPr>
             <w:r>
@@ -8548,7 +8549,7 @@
                 <w:rFonts w:ascii="Times New Roman" w:hAnsi="Times New Roman"/>
                 <w:b w:val="0"/>
                 <w:color w:val="000000"/>
-                <w:sz w:val="20"/>
+                <w:sz w:val="18"/>
               </w:rPr>
               <w:t>16; 7 evaluations</w:t>
             </w:r>
@@ -8590,7 +8591,7 @@
           <w:p>
             <w:pPr>
               <w:keepNext w:val="0"/>
-              <w:spacing w:before="0" w:after="40" w:line="480" w:lineRule="auto"/>
+              <w:spacing w:before="60" w:after="60" w:line="252" w:lineRule="auto"/>
               <w:jc w:val="left"/>
             </w:pPr>
             <w:r>
@@ -8598,7 +8599,7 @@
                 <w:rFonts w:ascii="Times New Roman" w:hAnsi="Times New Roman"/>
                 <w:b w:val="0"/>
                 <w:color w:val="000000"/>
-                <w:sz w:val="20"/>
+                <w:sz w:val="18"/>
               </w:rPr>
               <w:t>I-CNN</w:t>
             </w:r>
@@ -8618,7 +8619,7 @@
           <w:p>
             <w:pPr>
               <w:keepNext w:val="0"/>
-              <w:spacing w:before="0" w:after="40" w:line="480" w:lineRule="auto"/>
+              <w:spacing w:before="60" w:after="60" w:line="252" w:lineRule="auto"/>
               <w:jc w:val="center"/>
             </w:pPr>
             <w:r>
@@ -8626,7 +8627,7 @@
                 <w:rFonts w:ascii="Times New Roman" w:hAnsi="Times New Roman"/>
                 <w:b w:val="0"/>
                 <w:color w:val="000000"/>
-                <w:sz w:val="20"/>
+                <w:sz w:val="18"/>
               </w:rPr>
               <w:t>Filters; kernel; dilation</w:t>
             </w:r>
@@ -8646,7 +8647,7 @@
           <w:p>
             <w:pPr>
               <w:keepNext w:val="0"/>
-              <w:spacing w:before="0" w:after="40" w:line="480" w:lineRule="auto"/>
+              <w:spacing w:before="60" w:after="60" w:line="252" w:lineRule="auto"/>
               <w:jc w:val="center"/>
             </w:pPr>
             <w:r>
@@ -8654,7 +8655,7 @@
                 <w:rFonts w:ascii="Times New Roman" w:hAnsi="Times New Roman"/>
                 <w:b w:val="0"/>
                 <w:color w:val="000000"/>
-                <w:sz w:val="20"/>
+                <w:sz w:val="18"/>
               </w:rPr>
               <w:t>64,128,64,64; 5; 1,1,2,4</w:t>
             </w:r>
@@ -8696,7 +8697,7 @@
           <w:p>
             <w:pPr>
               <w:keepNext w:val="0"/>
-              <w:spacing w:before="0" w:after="40" w:line="480" w:lineRule="auto"/>
+              <w:spacing w:before="60" w:after="60" w:line="252" w:lineRule="auto"/>
               <w:jc w:val="left"/>
             </w:pPr>
             <w:r>
@@ -8704,7 +8705,7 @@
                 <w:rFonts w:ascii="Times New Roman" w:hAnsi="Times New Roman"/>
                 <w:b w:val="0"/>
                 <w:color w:val="000000"/>
-                <w:sz w:val="20"/>
+                <w:sz w:val="18"/>
               </w:rPr>
               <w:t>I-CNN</w:t>
             </w:r>
@@ -8724,7 +8725,7 @@
           <w:p>
             <w:pPr>
               <w:keepNext w:val="0"/>
-              <w:spacing w:before="0" w:after="40" w:line="480" w:lineRule="auto"/>
+              <w:spacing w:before="60" w:after="60" w:line="252" w:lineRule="auto"/>
               <w:jc w:val="center"/>
             </w:pPr>
             <w:r>
@@ -8732,7 +8733,7 @@
                 <w:rFonts w:ascii="Times New Roman" w:hAnsi="Times New Roman"/>
                 <w:b w:val="0"/>
                 <w:color w:val="000000"/>
-                <w:sz w:val="20"/>
+                <w:sz w:val="18"/>
               </w:rPr>
               <w:t>Dropout; P/S/noise weights</w:t>
             </w:r>
@@ -8752,7 +8753,7 @@
           <w:p>
             <w:pPr>
               <w:keepNext w:val="0"/>
-              <w:spacing w:before="0" w:after="40" w:line="480" w:lineRule="auto"/>
+              <w:spacing w:before="60" w:after="60" w:line="252" w:lineRule="auto"/>
               <w:jc w:val="center"/>
             </w:pPr>
             <w:r>
@@ -8760,7 +8761,7 @@
                 <w:rFonts w:ascii="Times New Roman" w:hAnsi="Times New Roman"/>
                 <w:b w:val="0"/>
                 <w:color w:val="000000"/>
-                <w:sz w:val="20"/>
+                <w:sz w:val="18"/>
               </w:rPr>
               <w:t>0.30; 1.5/2.5/0.5</w:t>
             </w:r>
@@ -8802,7 +8803,7 @@
           <w:p>
             <w:pPr>
               <w:keepNext w:val="0"/>
-              <w:spacing w:before="0" w:after="40" w:line="480" w:lineRule="auto"/>
+              <w:spacing w:before="60" w:after="60" w:line="252" w:lineRule="auto"/>
               <w:jc w:val="left"/>
             </w:pPr>
             <w:r>
@@ -8810,7 +8811,7 @@
                 <w:rFonts w:ascii="Times New Roman" w:hAnsi="Times New Roman"/>
                 <w:b w:val="0"/>
                 <w:color w:val="000000"/>
-                <w:sz w:val="20"/>
+                <w:sz w:val="18"/>
               </w:rPr>
               <w:t>Meta training</w:t>
             </w:r>
@@ -8830,7 +8831,7 @@
           <w:p>
             <w:pPr>
               <w:keepNext w:val="0"/>
-              <w:spacing w:before="0" w:after="40" w:line="480" w:lineRule="auto"/>
+              <w:spacing w:before="60" w:after="60" w:line="252" w:lineRule="auto"/>
               <w:jc w:val="center"/>
             </w:pPr>
             <w:r>
@@ -8838,7 +8839,7 @@
                 <w:rFonts w:ascii="Times New Roman" w:hAnsi="Times New Roman"/>
                 <w:b w:val="0"/>
                 <w:color w:val="000000"/>
-                <w:sz w:val="20"/>
+                <w:sz w:val="18"/>
               </w:rPr>
               <w:t>Adam LR; max epochs</w:t>
             </w:r>
@@ -8858,7 +8859,7 @@
           <w:p>
             <w:pPr>
               <w:keepNext w:val="0"/>
-              <w:spacing w:before="0" w:after="40" w:line="480" w:lineRule="auto"/>
+              <w:spacing w:before="60" w:after="60" w:line="252" w:lineRule="auto"/>
               <w:jc w:val="center"/>
             </w:pPr>
             <w:r>
@@ -8866,7 +8867,7 @@
                 <w:rFonts w:ascii="Times New Roman" w:hAnsi="Times New Roman"/>
                 <w:b w:val="0"/>
                 <w:color w:val="000000"/>
-                <w:sz w:val="20"/>
+                <w:sz w:val="18"/>
               </w:rPr>
               <w:t>5×10⁻⁴; 50</w:t>
             </w:r>
@@ -8908,7 +8909,7 @@
           <w:p>
             <w:pPr>
               <w:keepNext w:val="0"/>
-              <w:spacing w:before="0" w:after="40" w:line="480" w:lineRule="auto"/>
+              <w:spacing w:before="60" w:after="60" w:line="252" w:lineRule="auto"/>
               <w:jc w:val="left"/>
             </w:pPr>
             <w:r>
@@ -8916,7 +8917,7 @@
                 <w:rFonts w:ascii="Times New Roman" w:hAnsi="Times New Roman"/>
                 <w:b w:val="0"/>
                 <w:color w:val="000000"/>
-                <w:sz w:val="20"/>
+                <w:sz w:val="18"/>
               </w:rPr>
               <w:t>Meta training</w:t>
             </w:r>
@@ -8936,7 +8937,7 @@
           <w:p>
             <w:pPr>
               <w:keepNext w:val="0"/>
-              <w:spacing w:before="0" w:after="40" w:line="480" w:lineRule="auto"/>
+              <w:spacing w:before="60" w:after="60" w:line="252" w:lineRule="auto"/>
               <w:jc w:val="center"/>
             </w:pPr>
             <w:r>
@@ -8944,7 +8945,7 @@
                 <w:rFonts w:ascii="Times New Roman" w:hAnsi="Times New Roman"/>
                 <w:b w:val="0"/>
                 <w:color w:val="000000"/>
-                <w:sz w:val="20"/>
+                <w:sz w:val="18"/>
               </w:rPr>
               <w:t>Batch; validation patience</w:t>
             </w:r>
@@ -8964,7 +8965,7 @@
           <w:p>
             <w:pPr>
               <w:keepNext w:val="0"/>
-              <w:spacing w:before="0" w:after="40" w:line="480" w:lineRule="auto"/>
+              <w:spacing w:before="60" w:after="60" w:line="252" w:lineRule="auto"/>
               <w:jc w:val="center"/>
             </w:pPr>
             <w:r>
@@ -8972,7 +8973,7 @@
                 <w:rFonts w:ascii="Times New Roman" w:hAnsi="Times New Roman"/>
                 <w:b w:val="0"/>
                 <w:color w:val="000000"/>
-                <w:sz w:val="20"/>
+                <w:sz w:val="18"/>
               </w:rPr>
               <w:t>16; 10 evaluations</w:t>
             </w:r>
@@ -9013,12 +9014,12 @@
           </w:tcPr>
           <w:p>
             <w:pPr>
-              <w:spacing w:before="0" w:after="40"/>
-            </w:pPr>
-            <w:r>
-              <w:rPr>
-                <w:rFonts w:ascii="Times New Roman" w:hAnsi="Times New Roman"/>
-                <w:sz w:val="20"/>
+              <w:spacing w:before="60" w:after="60" w:line="252" w:lineRule="auto"/>
+            </w:pPr>
+            <w:r>
+              <w:rPr>
+                <w:rFonts w:ascii="Times New Roman" w:hAnsi="Times New Roman"/>
+                <w:sz w:val="18"/>
               </w:rPr>
               <w:t>All neural models</w:t>
             </w:r>
@@ -9038,7 +9039,7 @@
           <w:p>
             <w:pPr>
               <w:keepNext w:val="0"/>
-              <w:spacing w:before="0" w:after="40" w:line="480" w:lineRule="auto"/>
+              <w:spacing w:before="60" w:after="60" w:line="252" w:lineRule="auto"/>
               <w:jc w:val="center"/>
             </w:pPr>
             <w:r>
@@ -9046,7 +9047,7 @@
                 <w:rFonts w:ascii="Times New Roman" w:hAnsi="Times New Roman"/>
                 <w:b w:val="0"/>
                 <w:color w:val="000000"/>
-                <w:sz w:val="20"/>
+                <w:sz w:val="18"/>
               </w:rPr>
               <w:t>LR schedule; L2</w:t>
             </w:r>
@@ -9066,7 +9067,7 @@
           <w:p>
             <w:pPr>
               <w:keepNext w:val="0"/>
-              <w:spacing w:before="0" w:after="40" w:line="480" w:lineRule="auto"/>
+              <w:spacing w:before="60" w:after="60" w:line="252" w:lineRule="auto"/>
               <w:jc w:val="center"/>
             </w:pPr>
             <w:r>
@@ -9074,7 +9075,7 @@
                 <w:rFonts w:ascii="Times New Roman" w:hAnsi="Times New Roman"/>
                 <w:b w:val="0"/>
                 <w:color w:val="000000"/>
-                <w:sz w:val="20"/>
+                <w:sz w:val="18"/>
               </w:rPr>
               <w:t>Halve every 20 epochs; 1×10⁻⁴</w:t>
             </w:r>
@@ -9116,7 +9117,7 @@
           <w:p>
             <w:pPr>
               <w:keepNext w:val="0"/>
-              <w:spacing w:before="0" w:after="40" w:line="480" w:lineRule="auto"/>
+              <w:spacing w:before="60" w:after="60" w:line="252" w:lineRule="auto"/>
               <w:jc w:val="left"/>
             </w:pPr>
             <w:r>
@@ -9124,7 +9125,7 @@
                 <w:rFonts w:ascii="Times New Roman" w:hAnsi="Times New Roman"/>
                 <w:b w:val="0"/>
                 <w:color w:val="000000"/>
-                <w:sz w:val="20"/>
+                <w:sz w:val="18"/>
               </w:rPr>
               <w:t>Training</w:t>
             </w:r>
@@ -9144,7 +9145,7 @@
           <w:p>
             <w:pPr>
               <w:keepNext w:val="0"/>
-              <w:spacing w:before="0" w:after="40" w:line="480" w:lineRule="auto"/>
+              <w:spacing w:before="60" w:after="60" w:line="252" w:lineRule="auto"/>
               <w:jc w:val="center"/>
             </w:pPr>
             <w:r>
@@ -9152,7 +9153,7 @@
                 <w:rFonts w:ascii="Times New Roman" w:hAnsi="Times New Roman"/>
                 <w:b w:val="0"/>
                 <w:color w:val="000000"/>
-                <w:sz w:val="20"/>
+                <w:sz w:val="18"/>
               </w:rPr>
               <w:t>Output network</w:t>
             </w:r>
@@ -9172,7 +9173,7 @@
           <w:p>
             <w:pPr>
               <w:keepNext w:val="0"/>
-              <w:spacing w:before="0" w:after="40" w:line="480" w:lineRule="auto"/>
+              <w:spacing w:before="60" w:after="60" w:line="252" w:lineRule="auto"/>
               <w:jc w:val="center"/>
             </w:pPr>
             <w:r>
@@ -9180,7 +9181,7 @@
                 <w:rFonts w:ascii="Times New Roman" w:hAnsi="Times New Roman"/>
                 <w:b w:val="0"/>
                 <w:color w:val="000000"/>
-                <w:sz w:val="20"/>
+                <w:sz w:val="18"/>
               </w:rPr>
               <w:t>Best validation loss</w:t>
             </w:r>
@@ -9222,7 +9223,7 @@
           <w:p>
             <w:pPr>
               <w:keepNext w:val="0"/>
-              <w:spacing w:before="0" w:after="40" w:line="480" w:lineRule="auto"/>
+              <w:spacing w:before="60" w:after="60" w:line="252" w:lineRule="auto"/>
               <w:jc w:val="left"/>
             </w:pPr>
             <w:r>
@@ -9230,7 +9231,7 @@
                 <w:rFonts w:ascii="Times New Roman" w:hAnsi="Times New Roman"/>
                 <w:b w:val="0"/>
                 <w:color w:val="000000"/>
-                <w:sz w:val="20"/>
+                <w:sz w:val="18"/>
               </w:rPr>
               <w:t>Seeds</w:t>
             </w:r>
@@ -9249,18 +9250,14 @@
           </w:tcPr>
           <w:p>
             <w:pPr>
-              <w:keepNext w:val="0"/>
-              <w:spacing w:before="0" w:after="40" w:line="480" w:lineRule="auto"/>
-              <w:jc w:val="center"/>
-            </w:pPr>
-            <w:r>
-              <w:rPr>
-                <w:rFonts w:ascii="Times New Roman" w:hAnsi="Times New Roman"/>
-                <w:b w:val="0"/>
-                <w:color w:val="000000"/>
-                <w:sz w:val="20"/>
-              </w:rPr>
-              <w:t>Base / neural meta</w:t>
+              <w:spacing w:line="252" w:lineRule="auto" w:before="60" w:after="60"/>
+            </w:pPr>
+            <w:r>
+              <w:rPr>
+                <w:rFonts w:ascii="Times New Roman" w:hAnsi="Times New Roman"/>
+                <w:sz w:val="18"/>
+              </w:rPr>
+              <w:t>Base / neural meta / standalone baseline</w:t>
             </w:r>
           </w:p>
         </w:tc>
@@ -9277,18 +9274,14 @@
           </w:tcPr>
           <w:p>
             <w:pPr>
-              <w:keepNext w:val="0"/>
-              <w:spacing w:before="0" w:after="40" w:line="480" w:lineRule="auto"/>
-              <w:jc w:val="center"/>
-            </w:pPr>
-            <w:r>
-              <w:rPr>
-                <w:rFonts w:ascii="Times New Roman" w:hAnsi="Times New Roman"/>
-                <w:b w:val="0"/>
-                <w:color w:val="000000"/>
-                <w:sz w:val="20"/>
-              </w:rPr>
-              <w:t>42 / 42,43,44</w:t>
+              <w:spacing w:line="252" w:lineRule="auto" w:before="60" w:after="60"/>
+            </w:pPr>
+            <w:r>
+              <w:rPr>
+                <w:rFonts w:ascii="Times New Roman" w:hAnsi="Times New Roman"/>
+                <w:sz w:val="18"/>
+              </w:rPr>
+              <w:t>Base 42–44; meta 42–44 crossed within each base; PhaseNetMatched 42–44. Original ablations: base 42 only.</w:t>
             </w:r>
           </w:p>
         </w:tc>
@@ -9328,7 +9321,7 @@
           <w:p>
             <w:pPr>
               <w:keepNext w:val="0"/>
-              <w:spacing w:before="0" w:after="40" w:line="480" w:lineRule="auto"/>
+              <w:spacing w:before="60" w:after="60" w:line="252" w:lineRule="auto"/>
               <w:jc w:val="left"/>
             </w:pPr>
             <w:r>
@@ -9336,7 +9329,7 @@
                 <w:rFonts w:ascii="Times New Roman" w:hAnsi="Times New Roman"/>
                 <w:b w:val="0"/>
                 <w:color w:val="000000"/>
-                <w:sz w:val="20"/>
+                <w:sz w:val="18"/>
               </w:rPr>
               <w:t>Augmentation</w:t>
             </w:r>
@@ -9356,7 +9349,7 @@
           <w:p>
             <w:pPr>
               <w:keepNext w:val="0"/>
-              <w:spacing w:before="0" w:after="40" w:line="480" w:lineRule="auto"/>
+              <w:spacing w:before="60" w:after="60" w:line="252" w:lineRule="auto"/>
               <w:jc w:val="center"/>
             </w:pPr>
             <w:r>
@@ -9364,7 +9357,7 @@
                 <w:rFonts w:ascii="Times New Roman" w:hAnsi="Times New Roman"/>
                 <w:b w:val="0"/>
                 <w:color w:val="000000"/>
-                <w:sz w:val="20"/>
+                <w:sz w:val="18"/>
               </w:rPr>
               <w:t>Training population</w:t>
             </w:r>
@@ -9384,7 +9377,7 @@
           <w:p>
             <w:pPr>
               <w:keepNext w:val="0"/>
-              <w:spacing w:before="0" w:after="40" w:line="480" w:lineRule="auto"/>
+              <w:spacing w:before="60" w:after="60" w:line="252" w:lineRule="auto"/>
               <w:jc w:val="center"/>
             </w:pPr>
             <w:r>
@@ -9392,7 +9385,7 @@
                 <w:rFonts w:ascii="Times New Roman" w:hAnsi="Times New Roman"/>
                 <w:b w:val="0"/>
                 <w:color w:val="000000"/>
-                <w:sz w:val="20"/>
+                <w:sz w:val="18"/>
               </w:rPr>
               <w:t>Original + one augmented copy</w:t>
             </w:r>
@@ -9434,7 +9427,7 @@
           <w:p>
             <w:pPr>
               <w:keepNext w:val="0"/>
-              <w:spacing w:before="0" w:after="40" w:line="480" w:lineRule="auto"/>
+              <w:spacing w:before="60" w:after="60" w:line="252" w:lineRule="auto"/>
               <w:jc w:val="left"/>
             </w:pPr>
             <w:r>
@@ -9442,7 +9435,7 @@
                 <w:rFonts w:ascii="Times New Roman" w:hAnsi="Times New Roman"/>
                 <w:b w:val="0"/>
                 <w:color w:val="000000"/>
-                <w:sz w:val="20"/>
+                <w:sz w:val="18"/>
               </w:rPr>
               <w:t>Augmentation</w:t>
             </w:r>
@@ -9462,7 +9455,7 @@
           <w:p>
             <w:pPr>
               <w:keepNext w:val="0"/>
-              <w:spacing w:before="0" w:after="40" w:line="480" w:lineRule="auto"/>
+              <w:spacing w:before="60" w:after="60" w:line="252" w:lineRule="auto"/>
               <w:jc w:val="center"/>
             </w:pPr>
             <w:r>
@@ -9470,7 +9463,7 @@
                 <w:rFonts w:ascii="Times New Roman" w:hAnsi="Times New Roman"/>
                 <w:b w:val="0"/>
                 <w:color w:val="000000"/>
-                <w:sz w:val="20"/>
+                <w:sz w:val="18"/>
               </w:rPr>
               <w:t>Noise; scale; dropout</w:t>
             </w:r>
@@ -9490,7 +9483,7 @@
           <w:p>
             <w:pPr>
               <w:keepNext w:val="0"/>
-              <w:spacing w:before="0" w:after="40" w:line="480" w:lineRule="auto"/>
+              <w:spacing w:before="60" w:after="60" w:line="252" w:lineRule="auto"/>
               <w:jc w:val="center"/>
             </w:pPr>
             <w:r>
@@ -9498,7 +9491,7 @@
                 <w:rFonts w:ascii="Times New Roman" w:hAnsi="Times New Roman"/>
                 <w:b w:val="0"/>
                 <w:color w:val="000000"/>
-                <w:sz w:val="20"/>
+                <w:sz w:val="18"/>
               </w:rPr>
               <w:t>20 dB; 0.5–2.0; probability 0.20</w:t>
             </w:r>
@@ -9540,7 +9533,7 @@
           <w:p>
             <w:pPr>
               <w:keepNext w:val="0"/>
-              <w:spacing w:before="0" w:after="40" w:line="480" w:lineRule="auto"/>
+              <w:spacing w:before="60" w:after="60" w:line="252" w:lineRule="auto"/>
               <w:jc w:val="left"/>
             </w:pPr>
             <w:r>
@@ -9548,7 +9541,7 @@
                 <w:rFonts w:ascii="Times New Roman" w:hAnsi="Times New Roman"/>
                 <w:b w:val="0"/>
                 <w:color w:val="000000"/>
-                <w:sz w:val="20"/>
+                <w:sz w:val="18"/>
               </w:rPr>
               <w:t>Augmentation</w:t>
             </w:r>
@@ -9568,7 +9561,7 @@
           <w:p>
             <w:pPr>
               <w:keepNext w:val="0"/>
-              <w:spacing w:before="0" w:after="40" w:line="480" w:lineRule="auto"/>
+              <w:spacing w:before="60" w:after="60" w:line="252" w:lineRule="auto"/>
               <w:jc w:val="center"/>
             </w:pPr>
             <w:r>
@@ -9576,7 +9569,7 @@
                 <w:rFonts w:ascii="Times New Roman" w:hAnsi="Times New Roman"/>
                 <w:b w:val="0"/>
                 <w:color w:val="000000"/>
-                <w:sz w:val="20"/>
+                <w:sz w:val="18"/>
               </w:rPr>
               <w:t>Time shift / polarity flip</w:t>
             </w:r>
@@ -9596,7 +9589,7 @@
           <w:p>
             <w:pPr>
               <w:keepNext w:val="0"/>
-              <w:spacing w:before="0" w:after="40" w:line="480" w:lineRule="auto"/>
+              <w:spacing w:before="60" w:after="60" w:line="252" w:lineRule="auto"/>
               <w:jc w:val="center"/>
             </w:pPr>
             <w:r>
@@ -9604,7 +9597,7 @@
                 <w:rFonts w:ascii="Times New Roman" w:hAnsi="Times New Roman"/>
                 <w:b w:val="0"/>
                 <w:color w:val="000000"/>
-                <w:sz w:val="20"/>
+                <w:sz w:val="18"/>
               </w:rPr>
               <w:t>Disabled / disabled</w:t>
             </w:r>
@@ -9646,7 +9639,7 @@
           <w:p>
             <w:pPr>
               <w:keepNext w:val="0"/>
-              <w:spacing w:before="0" w:after="40" w:line="480" w:lineRule="auto"/>
+              <w:spacing w:before="60" w:after="60" w:line="252" w:lineRule="auto"/>
               <w:jc w:val="left"/>
             </w:pPr>
             <w:r>
@@ -9654,7 +9647,7 @@
                 <w:rFonts w:ascii="Times New Roman" w:hAnsi="Times New Roman"/>
                 <w:b w:val="0"/>
                 <w:color w:val="000000"/>
-                <w:sz w:val="20"/>
+                <w:sz w:val="18"/>
               </w:rPr>
               <w:t>Decoder</w:t>
             </w:r>
@@ -9674,7 +9667,7 @@
           <w:p>
             <w:pPr>
               <w:keepNext w:val="0"/>
-              <w:spacing w:before="0" w:after="40" w:line="480" w:lineRule="auto"/>
+              <w:spacing w:before="60" w:after="60" w:line="252" w:lineRule="auto"/>
               <w:jc w:val="center"/>
             </w:pPr>
             <w:r>
@@ -9682,7 +9675,7 @@
                 <w:rFonts w:ascii="Times New Roman" w:hAnsi="Times New Roman"/>
                 <w:b w:val="0"/>
                 <w:color w:val="000000"/>
-                <w:sz w:val="20"/>
+                <w:sz w:val="18"/>
               </w:rPr>
               <w:t>Detected / uncertain</w:t>
             </w:r>
@@ -9702,7 +9695,7 @@
           <w:p>
             <w:pPr>
               <w:keepNext w:val="0"/>
-              <w:spacing w:before="0" w:after="40" w:line="480" w:lineRule="auto"/>
+              <w:spacing w:before="60" w:after="60" w:line="252" w:lineRule="auto"/>
               <w:jc w:val="center"/>
             </w:pPr>
             <w:r>
@@ -9710,7 +9703,7 @@
                 <w:rFonts w:ascii="Times New Roman" w:hAnsi="Times New Roman"/>
                 <w:b w:val="0"/>
                 <w:color w:val="000000"/>
-                <w:sz w:val="20"/>
+                <w:sz w:val="18"/>
               </w:rPr>
               <w:t>≥0.30 and quality≥3 / otherwise≥0.15</w:t>
             </w:r>
@@ -9752,7 +9745,7 @@
           <w:p>
             <w:pPr>
               <w:keepNext w:val="0"/>
-              <w:spacing w:before="0" w:after="40" w:line="480" w:lineRule="auto"/>
+              <w:spacing w:before="60" w:after="60" w:line="252" w:lineRule="auto"/>
               <w:jc w:val="left"/>
             </w:pPr>
             <w:r>
@@ -9760,7 +9753,7 @@
                 <w:rFonts w:ascii="Times New Roman" w:hAnsi="Times New Roman"/>
                 <w:b w:val="0"/>
                 <w:color w:val="000000"/>
-                <w:sz w:val="20"/>
+                <w:sz w:val="18"/>
               </w:rPr>
               <w:t>Decoder</w:t>
             </w:r>
@@ -9780,7 +9773,7 @@
           <w:p>
             <w:pPr>
               <w:keepNext w:val="0"/>
-              <w:spacing w:before="0" w:after="40" w:line="480" w:lineRule="auto"/>
+              <w:spacing w:before="60" w:after="60" w:line="252" w:lineRule="auto"/>
               <w:jc w:val="center"/>
             </w:pPr>
             <w:r>
@@ -9788,7 +9781,7 @@
                 <w:rFonts w:ascii="Times New Roman" w:hAnsi="Times New Roman"/>
                 <w:b w:val="0"/>
                 <w:color w:val="000000"/>
-                <w:sz w:val="20"/>
+                <w:sz w:val="18"/>
               </w:rPr>
               <w:t>S after accepted P</w:t>
             </w:r>
@@ -9808,7 +9801,7 @@
           <w:p>
             <w:pPr>
               <w:keepNext w:val="0"/>
-              <w:spacing w:before="0" w:after="40" w:line="480" w:lineRule="auto"/>
+              <w:spacing w:before="60" w:after="60" w:line="252" w:lineRule="auto"/>
               <w:jc w:val="center"/>
             </w:pPr>
             <w:r>
@@ -9816,7 +9809,7 @@
                 <w:rFonts w:ascii="Times New Roman" w:hAnsi="Times New Roman"/>
                 <w:b w:val="0"/>
                 <w:color w:val="000000"/>
-                <w:sz w:val="20"/>
+                <w:sz w:val="18"/>
               </w:rPr>
               <w:t>0.1–30 s; within record</w:t>
             </w:r>
@@ -9858,7 +9851,7 @@
           <w:p>
             <w:pPr>
               <w:keepNext w:val="0"/>
-              <w:spacing w:before="0" w:after="40" w:line="480" w:lineRule="auto"/>
+              <w:spacing w:before="60" w:after="60" w:line="252" w:lineRule="auto"/>
               <w:jc w:val="left"/>
             </w:pPr>
             <w:r>
@@ -9866,7 +9859,7 @@
                 <w:rFonts w:ascii="Times New Roman" w:hAnsi="Times New Roman"/>
                 <w:b w:val="0"/>
                 <w:color w:val="000000"/>
-                <w:sz w:val="20"/>
+                <w:sz w:val="18"/>
               </w:rPr>
               <w:t>Evaluation</w:t>
             </w:r>
@@ -9886,7 +9879,7 @@
           <w:p>
             <w:pPr>
               <w:keepNext w:val="0"/>
-              <w:spacing w:before="0" w:after="40" w:line="480" w:lineRule="auto"/>
+              <w:spacing w:before="60" w:after="60" w:line="252" w:lineRule="auto"/>
               <w:jc w:val="center"/>
             </w:pPr>
             <w:r>
@@ -9894,7 +9887,7 @@
                 <w:rFonts w:ascii="Times New Roman" w:hAnsi="Times New Roman"/>
                 <w:b w:val="0"/>
                 <w:color w:val="000000"/>
-                <w:sz w:val="20"/>
+                <w:sz w:val="18"/>
               </w:rPr>
               <w:t>Primary / strict</w:t>
             </w:r>
@@ -9914,7 +9907,7 @@
           <w:p>
             <w:pPr>
               <w:keepNext w:val="0"/>
-              <w:spacing w:before="0" w:after="40" w:line="480" w:lineRule="auto"/>
+              <w:spacing w:before="60" w:after="60" w:line="252" w:lineRule="auto"/>
               <w:jc w:val="center"/>
             </w:pPr>
             <w:r>
@@ -9922,7 +9915,7 @@
                 <w:rFonts w:ascii="Times New Roman" w:hAnsi="Times New Roman"/>
                 <w:b w:val="0"/>
                 <w:color w:val="000000"/>
-                <w:sz w:val="20"/>
+                <w:sz w:val="18"/>
               </w:rPr>
               <w:t>Detected+uncertain / detected</w:t>
             </w:r>
@@ -9964,7 +9957,7 @@
           <w:p>
             <w:pPr>
               <w:keepNext w:val="0"/>
-              <w:spacing w:before="0" w:after="40" w:line="480" w:lineRule="auto"/>
+              <w:spacing w:before="60" w:after="60" w:line="252" w:lineRule="auto"/>
               <w:jc w:val="left"/>
             </w:pPr>
             <w:r>
@@ -9972,7 +9965,7 @@
                 <w:rFonts w:ascii="Times New Roman" w:hAnsi="Times New Roman"/>
                 <w:b w:val="0"/>
                 <w:color w:val="000000"/>
-                <w:sz w:val="20"/>
+                <w:sz w:val="18"/>
               </w:rPr>
               <w:t>Evaluation</w:t>
             </w:r>
@@ -9992,7 +9985,7 @@
           <w:p>
             <w:pPr>
               <w:keepNext w:val="0"/>
-              <w:spacing w:before="0" w:after="40" w:line="480" w:lineRule="auto"/>
+              <w:spacing w:before="60" w:after="60" w:line="252" w:lineRule="auto"/>
               <w:jc w:val="center"/>
             </w:pPr>
             <w:r>
@@ -10000,7 +9993,7 @@
                 <w:rFonts w:ascii="Times New Roman" w:hAnsi="Times New Roman"/>
                 <w:b w:val="0"/>
                 <w:color w:val="000000"/>
-                <w:sz w:val="20"/>
+                <w:sz w:val="18"/>
               </w:rPr>
               <w:t>Matching tolerances</w:t>
             </w:r>
@@ -10020,7 +10013,7 @@
           <w:p>
             <w:pPr>
               <w:keepNext w:val="0"/>
-              <w:spacing w:before="0" w:after="40" w:line="480" w:lineRule="auto"/>
+              <w:spacing w:before="60" w:after="60" w:line="252" w:lineRule="auto"/>
               <w:jc w:val="center"/>
             </w:pPr>
             <w:r>
@@ -10028,7 +10021,7 @@
                 <w:rFonts w:ascii="Times New Roman" w:hAnsi="Times New Roman"/>
                 <w:b w:val="0"/>
                 <w:color w:val="000000"/>
-                <w:sz w:val="20"/>
+                <w:sz w:val="18"/>
               </w:rPr>
               <w:t>±50, ±100, ±200 ms</w:t>
             </w:r>
@@ -10070,7 +10063,7 @@
           <w:p>
             <w:pPr>
               <w:keepNext w:val="0"/>
-              <w:spacing w:before="0" w:after="40" w:line="480" w:lineRule="auto"/>
+              <w:spacing w:before="60" w:after="60" w:line="252" w:lineRule="auto"/>
               <w:jc w:val="left"/>
             </w:pPr>
             <w:r>
@@ -10078,7 +10071,7 @@
                 <w:rFonts w:ascii="Times New Roman" w:hAnsi="Times New Roman"/>
                 <w:b w:val="0"/>
                 <w:color w:val="000000"/>
-                <w:sz w:val="20"/>
+                <w:sz w:val="18"/>
               </w:rPr>
               <w:t>Uncertainty</w:t>
             </w:r>
@@ -10098,7 +10091,7 @@
           <w:p>
             <w:pPr>
               <w:keepNext w:val="0"/>
-              <w:spacing w:before="0" w:after="40" w:line="480" w:lineRule="auto"/>
+              <w:spacing w:before="60" w:after="60" w:line="252" w:lineRule="auto"/>
               <w:jc w:val="center"/>
             </w:pPr>
             <w:r>
@@ -10106,7 +10099,7 @@
                 <w:rFonts w:ascii="Times New Roman" w:hAnsi="Times New Roman"/>
                 <w:b w:val="0"/>
                 <w:color w:val="000000"/>
-                <w:sz w:val="20"/>
+                <w:sz w:val="18"/>
               </w:rPr>
               <w:t>Mean-F1 source bootstrap</w:t>
             </w:r>
@@ -10126,7 +10119,7 @@
           <w:p>
             <w:pPr>
               <w:keepNext w:val="0"/>
-              <w:spacing w:before="0" w:after="40" w:line="480" w:lineRule="auto"/>
+              <w:spacing w:before="60" w:after="60" w:line="252" w:lineRule="auto"/>
               <w:jc w:val="center"/>
             </w:pPr>
             <w:r>
@@ -10134,7 +10127,7 @@
                 <w:rFonts w:ascii="Times New Roman" w:hAnsi="Times New Roman"/>
                 <w:b w:val="0"/>
                 <w:color w:val="000000"/>
-                <w:sz w:val="20"/>
+                <w:sz w:val="18"/>
               </w:rPr>
               <w:t>10,000 draws; NumPy seed 42</w:t>
             </w:r>
@@ -10727,6 +10720,48 @@
     </w:p>
     <w:p>
       <w:pPr>
+        <w:keepNext/>
+        <w:spacing w:line="360" w:lineRule="auto"/>
+      </w:pPr>
+      <w:r>
+        <w:rPr>
+          <w:rFonts w:ascii="Times New Roman" w:hAnsi="Times New Roman"/>
+          <w:b/>
+          <w:sz w:val="22"/>
+        </w:rPr>
+        <w:t>3.1. Executable workflow contracts and model replay</w:t>
+      </w:r>
+    </w:p>
+    <w:p>
+      <w:pPr>
+        <w:keepNext w:val="0"/>
+        <w:spacing w:line="480" w:lineRule="auto"/>
+      </w:pPr>
+      <w:r>
+        <w:rPr>
+          <w:rFonts w:ascii="Times New Roman" w:hAnsi="Times New Roman"/>
+          <w:b w:val="0"/>
+          <w:sz w:val="22"/>
+        </w:rPr>
+        <w:t>The reproducibility package exposes explicit contracts for source disjointness, augmentation parentage, OOF exclusion and the 15-channel feature schema (Supplementary Table S19). A standard-library Python example generates grouped synthetic records and rejects deliberately invalid source overlap, changed parent identity, OOF contamination, swapped feature order and altered artifact bytes. It also checks record/source/reference-label identity across the 24 published expanded prediction sets. These are executable software checks, not comparisons of predictive performance.</w:t>
+      </w:r>
+    </w:p>
+    <w:p>
+      <w:pPr>
+        <w:keepNext w:val="0"/>
+        <w:spacing w:line="480" w:lineRule="auto"/>
+      </w:pPr>
+      <w:r>
+        <w:rPr>
+          <w:rFonts w:ascii="Times New Roman" w:hAnsi="Times New Roman"/>
+          <w:b w:val="0"/>
+          <w:sz w:val="22"/>
+        </w:rPr>
+        <w:t>A separate MATLAB entry point loads frozen CNN, TCN, meta and PhaseNetMatched checkpoints, reconstructs features from identified waveform CSVs, applies the retained decoder, and compares predictions with published references. It checks checkpoint hashes and that test sources occur in neither the saved fitting nor validation memberships. CPU and GPU execution are supported; the custom PhaseSkipCrop layer is included. Full replay uses 335 records, whereas the verification reported here uses prespecified lexical-order smoke subsets: three records per output on GPU and one on CPU. No weights, thresholds or source partitions were optimized during this software revision.</w:t>
+      </w:r>
+    </w:p>
+    <w:p>
+      <w:pPr>
         <w:widowControl/>
         <w:spacing w:before="0" w:after="0" w:line="480" w:lineRule="auto"/>
         <w:ind w:left="0" w:right="0" w:firstLine="0"/>
@@ -10809,7 +10844,7 @@
           <w:color w:val="000000"/>
           <w:sz w:val="24"/>
         </w:rPr>
-        <w:t>The evaluation combines the original 40-fit experiment with 66 additional fits, for 106 training invocations in total. The extension repeats the CNN/TCN/OOF/meta pipeline at two additional base seeds and adds three PhaseNet-style fits per input mode. Tables 4–5 and Figures 5–12 retain the original base-42 experiment and its record-level diagnostics; Tables 6–7 report the expanded experiment. Supplementary Tables S15–S18 document seed-level results, strict scoring, and fit accounting. The extension followed inspection of the original experiment, so it is not an independently preregistered confirmation. Test scores were not used for checkpoint selection.</w:t>
+        <w:t>The evaluation combines the original 40-fit experiment with 66 additional fits, for 106 training invocations in total. The extension repeats the CNN/TCN/OOF/meta pipeline at two additional base seeds and adds three PhaseNet-style fits per input mode. Tables 4–5 and Figures 5–10 and 13–14 retain the original base-42 experiment and its record-level diagnostics; Tables 6–7 report the expanded experiment. Supplementary Tables S15–S18 document seed-level results, strict scoring, and fit accounting. The extension followed inspection of the original experiment, so it is not an independently preregistered confirmation. Test scores were not used for checkpoint selection.</w:t>
       </w:r>
     </w:p>
     <w:p>
@@ -11927,7 +11962,7 @@
                     </pic:cNvPicPr>
                   </pic:nvPicPr>
                   <pic:blipFill>
-                    <a:blip r:embed="rId12"/>
+                    <a:blip r:embed="rId30"/>
                     <a:stretch>
                       <a:fillRect/>
                     </a:stretch>
@@ -12936,7 +12971,7 @@
                     </pic:cNvPicPr>
                   </pic:nvPicPr>
                   <pic:blipFill>
-                    <a:blip r:embed="rId14"/>
+                    <a:blip r:embed="rId31"/>
                     <a:stretch>
                       <a:fillRect/>
                     </a:stretch>
@@ -13210,7 +13245,7 @@
           <w:color w:val="000000"/>
           <w:sz w:val="24"/>
         </w:rPr>
-        <w:t>Seed-42 percentile errors are shown in Fig. 10. Supplementary Fig. S4 identifies the largest residuals and Fig. 12 shows selected waveform cases.</w:t>
+        <w:t>Base-42/meta-42 percentile errors are shown in Fig. 10; larger accepted errors and selected waveform cases are discussed in Section 4.5.</w:t>
       </w:r>
     </w:p>
     <w:p>
@@ -13254,7 +13289,7 @@
                     </pic:cNvPicPr>
                   </pic:nvPicPr>
                   <pic:blipFill>
-                    <a:blip r:embed="rId16"/>
+                    <a:blip r:embed="rId26"/>
                     <a:stretch>
                       <a:fillRect/>
                     </a:stretch>
@@ -13318,7 +13353,7 @@
     <w:p>
       <w:pPr/>
       <w:r>
-        <w:t>Across the three base-seed means, Full3C stacking F1@100 ms was 0.8694 ± 0.0078 for P and 0.5780 ± 0.0064 for S; Z-only values were 0.8723 ± 0.0060 and 0.3384 ± 0.0096. Each base mean averages three meta fits. Full3C exceeded Z-only S F1 in all nine paired fits, while P differences were small and changed direction. Table 6 separates these summaries from the three-seed standalone baseline.</w:t>
+        <w:t>Across the three base-seed means, Full3C stacking F1@100 ms was 0.8694 ± 0.0078 for P and 0.5780 ± 0.0064 for S; Z-only values were 0.8723 ± 0.0060 and 0.3384 ± 0.0096. Each base mean averages three meta fits. Full3C exceeded Z-only S F1 in all nine paired fits, while P differences were small and changed direction. Table 6 separates these summaries from the three-seed standalone baseline. Figure 11 compares the methods; Fig. 12 separates individual meta fits from their base-specific means. The Full3C S advantage persists across all base seeds, while the small P differences vary in direction. These repetitions characterize initialization variability on the fixed split, rather than robustness to new source partitions.</w:t>
       </w:r>
     </w:p>
     <w:p>
@@ -13365,6 +13400,7 @@
           </w:tcPr>
           <w:p>
             <w:pPr>
+              <w:keepNext/>
               <w:spacing w:after="80" w:before="80" w:line="240" w:lineRule="auto"/>
             </w:pPr>
             <w:r>
@@ -13390,6 +13426,7 @@
           </w:tcPr>
           <w:p>
             <w:pPr>
+              <w:keepNext/>
               <w:spacing w:after="80" w:before="80" w:line="240" w:lineRule="auto"/>
             </w:pPr>
             <w:r>
@@ -13415,6 +13452,7 @@
           </w:tcPr>
           <w:p>
             <w:pPr>
+              <w:keepNext/>
               <w:spacing w:after="80" w:before="80" w:line="240" w:lineRule="auto"/>
             </w:pPr>
             <w:r>
@@ -13440,6 +13478,7 @@
           </w:tcPr>
           <w:p>
             <w:pPr>
+              <w:keepNext/>
               <w:spacing w:after="80" w:before="80" w:line="240" w:lineRule="auto"/>
             </w:pPr>
             <w:r>
@@ -13465,6 +13504,7 @@
           </w:tcPr>
           <w:p>
             <w:pPr>
+              <w:keepNext/>
               <w:spacing w:after="80" w:before="80" w:line="240" w:lineRule="auto"/>
             </w:pPr>
             <w:r>
@@ -13490,6 +13530,7 @@
           </w:tcPr>
           <w:p>
             <w:pPr>
+              <w:keepNext/>
               <w:spacing w:after="80" w:before="80" w:line="240" w:lineRule="auto"/>
             </w:pPr>
             <w:r>
@@ -14148,6 +14189,7 @@
           </w:tcPr>
           <w:p>
             <w:pPr>
+              <w:keepNext/>
               <w:spacing w:after="80" w:before="80" w:line="240" w:lineRule="auto"/>
             </w:pPr>
             <w:r>
@@ -14173,6 +14215,7 @@
           </w:tcPr>
           <w:p>
             <w:pPr>
+              <w:keepNext/>
               <w:spacing w:after="80" w:before="80" w:line="240" w:lineRule="auto"/>
             </w:pPr>
             <w:r>
@@ -14198,6 +14241,7 @@
           </w:tcPr>
           <w:p>
             <w:pPr>
+              <w:keepNext/>
               <w:spacing w:after="80" w:before="80" w:line="240" w:lineRule="auto"/>
             </w:pPr>
             <w:r>
@@ -14223,6 +14267,7 @@
           </w:tcPr>
           <w:p>
             <w:pPr>
+              <w:keepNext/>
               <w:spacing w:after="80" w:before="80" w:line="240" w:lineRule="auto"/>
             </w:pPr>
             <w:r>
@@ -15047,8 +15092,160 @@
     </w:tbl>
     <w:p>
       <w:pPr>
+        <w:keepNext/>
+        <w:pageBreakBefore/>
+        <w:spacing w:line="240" w:lineRule="auto"/>
+        <w:jc w:val="center"/>
+      </w:pPr>
+      <w:r>
+        <w:drawing>
+          <wp:inline xmlns:a="http://schemas.openxmlformats.org/drawingml/2006/main" xmlns:pic="http://schemas.openxmlformats.org/drawingml/2006/picture">
+            <wp:extent cx="5669280" cy="2837553"/>
+            <wp:docPr id="1812676290" name="Picture 1812676290"/>
+            <wp:cNvGraphicFramePr>
+              <a:graphicFrameLocks noChangeAspect="1"/>
+            </wp:cNvGraphicFramePr>
+            <a:graphic>
+              <a:graphicData uri="http://schemas.openxmlformats.org/drawingml/2006/picture">
+                <pic:pic>
+                  <pic:nvPicPr>
+                    <pic:cNvPr id="0" name="Figure_11.jpg"/>
+                    <pic:cNvPicPr/>
+                  </pic:nvPicPr>
+                  <pic:blipFill>
+                    <a:blip r:embed="rId22"/>
+                    <a:stretch>
+                      <a:fillRect/>
+                    </a:stretch>
+                  </pic:blipFill>
+                  <pic:spPr>
+                    <a:xfrm>
+                      <a:off x="0" y="0"/>
+                      <a:ext cx="5669280" cy="2837553"/>
+                    </a:xfrm>
+                    <a:prstGeom prst="rect"/>
+                  </pic:spPr>
+                </pic:pic>
+              </a:graphicData>
+            </a:graphic>
+          </wp:inline>
+        </w:drawing>
+      </w:r>
+    </w:p>
+    <w:p>
+      <w:pPr>
+        <w:spacing w:line="276" w:lineRule="auto" w:after="200"/>
+      </w:pPr>
+      <w:r>
+        <w:rPr>
+          <w:rFonts w:ascii="Times New Roman" w:hAnsi="Times New Roman"/>
+          <w:sz w:val="20"/>
+        </w:rPr>
+        <w:t>Fig. 11. Stacker versus PhaseNet-style MATLAB baseline on the same 335 test records from 317 sources: (a) P and (b) S F1 at ±100 ms, accepting detected and uncertain picks. Bars show means. For stacking, each white point is a mean over three meta seeds for one base seed; error bars are the sample SD of the three base-specific means. For the baseline, points are its three independently initialized fits and error bars are their sample SD. These are seed SDs, not confidence intervals; paired source-cluster intervals are reported in Table 7. Data and decoder are shared, but inputs and compute budgets differ.</w:t>
+      </w:r>
+    </w:p>
+    <w:p>
+      <w:pPr>
+        <w:keepNext/>
+        <w:pageBreakBefore/>
+        <w:spacing w:line="240" w:lineRule="auto"/>
+        <w:jc w:val="center"/>
+      </w:pPr>
+      <w:r>
+        <w:drawing>
+          <wp:inline xmlns:a="http://schemas.openxmlformats.org/drawingml/2006/main" xmlns:pic="http://schemas.openxmlformats.org/drawingml/2006/picture">
+            <wp:extent cx="5669280" cy="2983218"/>
+            <wp:docPr id="1812676291" name="Picture 1812676291"/>
+            <wp:cNvGraphicFramePr>
+              <a:graphicFrameLocks noChangeAspect="1"/>
+            </wp:cNvGraphicFramePr>
+            <a:graphic>
+              <a:graphicData uri="http://schemas.openxmlformats.org/drawingml/2006/picture">
+                <pic:pic>
+                  <pic:nvPicPr>
+                    <pic:cNvPr id="0" name="Figure_12.jpg"/>
+                    <pic:cNvPicPr/>
+                  </pic:nvPicPr>
+                  <pic:blipFill>
+                    <a:blip r:embed="rId23"/>
+                    <a:stretch>
+                      <a:fillRect/>
+                    </a:stretch>
+                  </pic:blipFill>
+                  <pic:spPr>
+                    <a:xfrm>
+                      <a:off x="0" y="0"/>
+                      <a:ext cx="5669280" cy="2983218"/>
+                    </a:xfrm>
+                    <a:prstGeom prst="rect"/>
+                  </pic:spPr>
+                </pic:pic>
+              </a:graphicData>
+            </a:graphic>
+          </wp:inline>
+        </w:drawing>
+      </w:r>
+    </w:p>
+    <w:p>
+      <w:pPr>
+        <w:spacing w:line="276" w:lineRule="auto" w:after="200"/>
+      </w:pPr>
+      <w:r>
+        <w:rPr>
+          <w:rFonts w:ascii="Times New Roman" w:hAnsi="Times New Roman"/>
+          <w:sz w:val="20"/>
+        </w:rPr>
+        <w:t>Fig. 12. Stacker initialization variability on one fixed source split: (a) P and (b) S F1 at ±100 ms. Colour identifies input mode, open symbols identify individual meta seeds, and filled diamonds show the three-meta-seed mean within each base seed. Horizontal offsets separate overlapping observations; lines connect means only as a visual guide. Panel y-axis ranges differ to expose the small P variations. Meta fits sharing a base are dependent. The source partition, OOF assignments and augmentation seeds remain fixed; this figure does not measure split or geographic uncertainty.</w:t>
+      </w:r>
+    </w:p>
+    <w:p>
+      <w:pPr>
+        <w:keepNext/>
+        <w:pageBreakBefore/>
+        <w:spacing w:line="360" w:lineRule="auto"/>
+      </w:pPr>
+      <w:r>
+        <w:rPr>
+          <w:rFonts w:ascii="Times New Roman" w:hAnsi="Times New Roman"/>
+          <w:b/>
+          <w:sz w:val="22"/>
+        </w:rPr>
+        <w:t>4.4.2. Demonstration of computational audit and reuse</w:t>
+      </w:r>
+    </w:p>
+    <w:p>
+      <w:pPr>
+        <w:keepNext w:val="0"/>
+        <w:spacing w:line="480" w:lineRule="auto"/>
+      </w:pPr>
+      <w:r>
+        <w:rPr>
+          <w:rFonts w:ascii="Times New Roman" w:hAnsi="Times New Roman"/>
+          <w:b w:val="0"/>
+          <w:sz w:val="22"/>
+        </w:rPr>
+        <w:t>The synthetic contract demonstration used 60 records from 20 sources, retained source identity for 42 augmented training records, and passed three grouped OOF checks. All five deliberately invalid cases were rejected. Separately, all 106 checkpoints loaded successfully and their saved fitting, validation and test source memberships passed disjointness checks. The 24 expanded model output sets reproduced the archived pick times and statuses on the three-record GPU subset and one-record CPU subset (Supplementary Table S21). This verifies an executable route from identified inputs and saved networks to reported predictions; it does not claim that full 335-record model inference was repeated in this revision.</w:t>
+      </w:r>
+    </w:p>
+    <w:p>
+      <w:pPr>
+        <w:keepNext w:val="0"/>
+        <w:spacing w:line="480" w:lineRule="auto"/>
+      </w:pPr>
+      <w:r>
+        <w:rPr>
+          <w:rFonts w:ascii="Times New Roman" w:hAnsi="Times New Roman"/>
+          <w:b w:val="0"/>
+          <w:sz w:val="22"/>
+        </w:rPr>
+        <w:t>The transferable software elements are identity propagation, explicit feature schemas, artifact verification and dependency-aware summaries. They require a scientifically meaningful grouping key when adapted to another geoscientific problem. The examples demonstrate detectable failure modes and documented reuse rather than a new grouped-OOF algorithm or a predictive advantage over PhaseNetMatched.</w:t>
+      </w:r>
+    </w:p>
+    <w:p>
+      <w:pPr>
         <w:pStyle w:val="3"/>
         <w:keepNext/>
+        <w:pageBreakBefore w:val="0"/>
         <w:widowControl/>
         <w:spacing w:before="0" w:after="0" w:line="276" w:lineRule="auto"/>
         <w:ind w:left="0" w:right="0" w:firstLine="0"/>
@@ -15138,6 +15335,12 @@
           <w:sz w:val="24"/>
         </w:rPr>
         <w:t>S timing remains a practical limitation: in the original base-42/meta-42 stacker, accepted S RMSE was 2063.33 ms and 7.88% of accepted S errors exceeded 1 s. High candidate coverage is therefore insufficient evidence for automatic catalogue use. The PhaseNet-style baseline improves mean timing accuracy under the matched protocol, but neither workflow has been validated for continuous monitoring or downstream location accuracy. These outputs require application-specific quality control and independent validation before use in location or tomography.</w:t>
+      </w:r>
+      <w:r>
+        <w:rPr>
+          <w:rFonts w:ascii="Times New Roman" w:hAnsi="Times New Roman"/>
+        </w:rPr>
+        <w:t xml:space="preserve"> Figure 13 displays the original accepted-error tails, and Fig. 14 shows the selected waveform cases.</w:t>
       </w:r>
     </w:p>
     <w:p>
@@ -15269,7 +15472,7 @@
                     </pic:cNvPicPr>
                   </pic:nvPicPr>
                   <pic:blipFill>
-                    <a:blip r:embed="rId17"/>
+                    <a:blip r:embed="rId27"/>
                     <a:stretch>
                       <a:fillRect/>
                     </a:stretch>
@@ -15315,7 +15518,7 @@
           <w:color w:val="000000"/>
           <w:sz w:val="24"/>
         </w:rPr>
-        <w:t>Fig. 11. Base-42/meta-42 accepted errors. Left: full-range histograms on logarithmic axes. Right: fractions exceeding 500, 1000, and 2000 ms. Rows show P and S; denominators are accepted picks.</w:t>
+        <w:t>Fig. 13. Base-42/meta-42 accepted errors. Left: full-range histograms on logarithmic axes. Right: fractions exceeding 500, 1000, and 2000 ms. Rows show P and S; denominators are accepted picks.</w:t>
       </w:r>
     </w:p>
     <w:p>
@@ -15361,7 +15564,7 @@
                     </pic:cNvPicPr>
                   </pic:nvPicPr>
                   <pic:blipFill>
-                    <a:blip r:embed="rId18"/>
+                    <a:blip r:embed="rId28"/>
                     <a:stretch>
                       <a:fillRect/>
                     </a:stretch>
@@ -15405,7 +15608,7 @@
           <w:color w:val="000000"/>
           <w:sz w:val="24"/>
         </w:rPr>
-        <w:t>Fig. 12. Selected Full3C base-42/meta-42 cases: largest accepted P error, largest accepted S error, and first S not-detected and uncertain cases when present. Components are normalized individually and offset. Dashed lines mark true arrivals; solid lines mark reported predictions. Event IDs identify the selection.</w:t>
+        <w:t>Fig. 14. Selected Full3C base-42/meta-42 cases: largest accepted P error, largest accepted S error, and first S not-detected and uncertain cases when present. Components are normalized individually and offset. Dashed lines mark true arrivals; solid lines mark reported predictions. Event IDs identify the selection.</w:t>
       </w:r>
     </w:p>
     <w:p>
@@ -15532,7 +15735,7 @@
           <w:color w:val="000000"/>
           <w:sz w:val="24"/>
         </w:rPr>
-        <w:t>The source-grouped workflow makes training membership, temporal feature construction, and evaluation provenance explicit. Across three base seeds crossed with three meta seeds, the Full3C–Z-only S difference persisted on the same curated source-held-out test set. This supports a component-access finding within that population, while transfer to other populations remains untested.</w:t>
+        <w:t>The source-grouped workflow makes training membership, temporal feature construction, and evaluation provenance explicit. Across three base seeds crossed with three meta seeds, the Full3C–Z-only S difference persisted on the same curated source-held-out test set. This supports a component-access finding within that population, while transfer to other populations remains untested. Its computational contribution is made inspectable through executable identity and feature checks, a model-level replay interface, and a public checkpoint inventory. These software demonstrations establish implementation behavior and reuse paths, not additional predictive or geographic generalization.</w:t>
       </w:r>
     </w:p>
     <w:p>
@@ -16063,7 +16266,7 @@
           <w:color w:val="000000"/>
           <w:sz w:val="24"/>
         </w:rPr>
-        <w:t>Code, configurations, source lists, frozen predictions, and numerical audit scripts for the original experiment and 66-fit extension are publicly archived in release v1.3.0 at https://doi.org/10.5281/zenodo.22782746. The release corresponds to Git commit e235f749540a56b763eca5903abb9592b9ed02b8 at https://github.com/rcw3712/ICNN_MetaPicker_Curated_STEAD_MATLAB/tree/v1.3.0. The submission_20260915 directory retains the original 40-fit experiment; strengthening_20260916 contains the additional runner, record-level results, portable numerical audit, and hash manifest. All 367 entries in the extension manifest were verified against the published Zenodo archive. The earlier v1.2.0 DOI 10.5281/zenodo.22760733 identifies only the original release. Raw waveforms, large probability curves, caches, and trained checkpoints are excluded; reproducing training requires the identified STEAD inputs. This manuscript includes a subsequent availability-statement update; the archived manuscript snapshot predates DOI assignment, while its numerical results are unchanged.</w:t>
+        <w:t>Code, source lists, predictions and the expanded numerical audit are archived in v1.3.0 at https://doi.org/10.5281/zenodo.22782746. Release v1.4.0 at https://github.com/rcw3712/ICNN_MetaPicker_Curated_STEAD_MATLAB/releases/tag/v1.4.0 adds reproducibility_20260916, containing all 106 trained checkpoints, the custom PhaseNet layer, portable inference entry points, synthetic demonstrations, checkpoint/input hashes, and documentary threshold provenance. Current manuscripts and separate figure files accompany this software update. The original training packages remain available under their dated directories. Raw STEAD waveforms and large caches are not redistributed. Exact model replay requires the identified curated waveform CSVs; the public synthetic demonstration and checkpoint-loading audit run without external waveform data. Software-verification receipts distinguish the tested smoke subsets from a supported full 335-record replay.</w:t>
       </w:r>
     </w:p>
     <w:p>

</xml_diff>